<commit_message>
Add image extraction and pipeline explainer pages
- Index pages, embedded raster images and vector figures (e.g. drawn
  stress-strain curves) as blocks with bbox and detected caption
- images.py: page snapshots and caption-matched figures exported as PNG,
  with block id and PNG sha256 as provenance; MISSING when not found
- Template appendices filled with COA and infusion snapshots, machine
  report page, stress-strain curves and before/after specimen pictures
- Dummy data: vector stress-strain plot and specimen pictures PDF
- docs/pipeline_explained.html (plain-language) and
  docs/pipeline_architecture.html (engineering design note)

Co-Authored-By: Claude Opus 5.5 (1M context) <noreply@anthropic.com>
</commit_message>
<xml_diff>
--- a/data/templet/dnv_poc_template.docx
+++ b/data/templet/dnv_poc_template.docx
@@ -12606,101 +12606,7 @@
           <w:highlight w:val="cyan"/>
           <w:lang w:val="en-US"/>
         </w:rPr>
-        <w:t>Picture / screenshot of the COA from the TR folder</w:t>
-      </w:r>
-    </w:p>
-    <w:p>
-      <w:pPr>
-        <w:pStyle w:val="ListParagraph"/>
-        <w:ind w:left="0"/>
-        <w:jc w:val="center"/>
-        <w:rPr>
-          <w:rStyle w:val="FakeCharacterStyle"/>
-          <w:rFonts w:cstheme="minorHAnsi"/>
-          <w:b/>
-          <w:bCs/>
-          <w:noProof/>
-          <w:sz w:val="22"/>
-          <w:szCs w:val="22"/>
-          <w:lang w:val="en-US"/>
-        </w:rPr>
-      </w:pPr>
-    </w:p>
-    <w:p>
-      <w:pPr>
-        <w:jc w:val="center"/>
-        <w:rPr>
-          <w:b/>
-          <w:bCs/>
-          <w:lang w:val="en-US"/>
-        </w:rPr>
-      </w:pPr>
-      <w:r>
-        <w:rPr>
-          <w:b/>
-          <w:bCs/>
-          <w:lang w:val="en-US"/>
-        </w:rPr>
-        <w:t xml:space="preserve">Appendix </w:t>
-      </w:r>
-      <w:r>
-        <w:rPr>
-          <w:b/>
-          <w:bCs/>
-          <w:lang w:val="en-US"/>
-        </w:rPr>
-        <w:t>2</w:t>
-      </w:r>
-      <w:r>
-        <w:rPr>
-          <w:b/>
-          <w:bCs/>
-          <w:lang w:val="en-US"/>
-        </w:rPr>
-        <w:t xml:space="preserve">: </w:t>
-      </w:r>
-      <w:r>
-        <w:rPr>
-          <w:b/>
-          <w:bCs/>
-          <w:lang w:val="en-US"/>
-        </w:rPr>
-        <w:t>Infusion report – Laminate # 260612VB-A</w:t>
-      </w:r>
-    </w:p>
-    <w:p>
-      <w:pPr>
-        <w:pStyle w:val="ListParagraph"/>
-        <w:ind w:left="0"/>
-        <w:jc w:val="center"/>
-        <w:rPr>
-          <w:rStyle w:val="FakeCharacterStyle"/>
-          <w:rFonts w:cstheme="minorHAnsi"/>
-          <w:b/>
-          <w:bCs/>
-          <w:noProof/>
-          <w:sz w:val="22"/>
-          <w:szCs w:val="22"/>
-          <w:lang w:val="en-US"/>
-        </w:rPr>
-      </w:pPr>
-    </w:p>
-    <w:p>
-      <w:pPr>
-        <w:pStyle w:val="ListParagraph"/>
-        <w:ind w:left="0"/>
-        <w:jc w:val="center"/>
-        <w:rPr>
-          <w:rStyle w:val="FakeCharacterStyle"/>
-          <w:rFonts w:cstheme="minorHAnsi"/>
-          <w:b/>
-          <w:bCs/>
-          <w:noProof/>
-          <w:sz w:val="22"/>
-          <w:szCs w:val="22"/>
-          <w:lang w:val="en-US"/>
-        </w:rPr>
-      </w:pPr>
+      </w:r>
       <w:r>
         <w:rPr>
           <w:rStyle w:val="FakeCharacterStyle"/>
@@ -12713,7 +12619,7 @@
           <w:highlight w:val="cyan"/>
           <w:lang w:val="en-US"/>
         </w:rPr>
-        <w:t>Picture / Screeshot or from TR folder or directly from WaveFront ?</w:t>
+        <w:t>{{image:coa_snapshot}}</w:t>
       </w:r>
     </w:p>
     <w:p>
@@ -12756,7 +12662,7 @@
           <w:bCs/>
           <w:lang w:val="en-US"/>
         </w:rPr>
-        <w:t>3</w:t>
+        <w:t>2</w:t>
       </w:r>
       <w:r>
         <w:rPr>
@@ -12772,86 +12678,21 @@
           <w:bCs/>
           <w:lang w:val="en-US"/>
         </w:rPr>
-        <w:t>TR</w:t>
+        <w:t xml:space="preserve">Infusion report – Laminate # </w:t>
       </w:r>
       <w:r>
         <w:rPr>
           <w:b/>
           <w:bCs/>
-          <w:highlight w:val="cyan"/>
-          <w:lang w:val="en-US"/>
-        </w:rPr>
-        <w:t>YY</w:t>
-      </w:r>
-      <w:r>
-        <w:rPr>
-          <w:b/>
-          <w:bCs/>
-          <w:lang w:val="en-US"/>
-        </w:rPr>
-        <w:t>_C</w:t>
-      </w:r>
-      <w:r>
-        <w:rPr>
-          <w:b/>
-          <w:bCs/>
-          <w:highlight w:val="cyan"/>
-          <w:lang w:val="en-US"/>
-        </w:rPr>
-        <w:t>XXXX</w:t>
-      </w:r>
-      <w:r>
-        <w:rPr>
-          <w:b/>
-          <w:bCs/>
-          <w:lang w:val="en-US"/>
-        </w:rPr>
-        <w:t xml:space="preserve">– </w:t>
-      </w:r>
-      <w:r>
-        <w:rPr>
-          <w:b/>
-          <w:bCs/>
-          <w:highlight w:val="cyan"/>
-          <w:lang w:val="en-US"/>
-        </w:rPr>
-        <w:t>Test name</w:t>
-      </w:r>
-      <w:r>
-        <w:rPr>
-          <w:b/>
-          <w:bCs/>
-          <w:lang w:val="en-US"/>
-        </w:rPr>
-        <w:t xml:space="preserve"> </w:t>
-      </w:r>
-      <w:r>
-        <w:rPr>
-          <w:b/>
-          <w:bCs/>
-          <w:lang w:val="en-US"/>
-        </w:rPr>
-        <w:t>–</w:t>
-      </w:r>
-      <w:r>
-        <w:rPr>
-          <w:b/>
-          <w:bCs/>
-          <w:lang w:val="en-US"/>
-        </w:rPr>
-        <w:t xml:space="preserve"> Test</w:t>
-      </w:r>
-      <w:r>
-        <w:rPr>
-          <w:b/>
-          <w:bCs/>
-          <w:lang w:val="en-US"/>
-        </w:rPr>
-        <w:t xml:space="preserve"> report</w:t>
+          <w:lang w:val="en-US"/>
+        </w:rPr>
+        <w:t>{{laminate_id}}</w:t>
       </w:r>
     </w:p>
     <w:p>
       <w:pPr>
+        <w:pStyle w:val="ListParagraph"/>
+        <w:ind w:left="0"/>
         <w:jc w:val="center"/>
         <w:rPr>
           <w:rStyle w:val="FakeCharacterStyle"/>
@@ -12867,6 +12708,8 @@
     </w:p>
     <w:p>
       <w:pPr>
+        <w:pStyle w:val="ListParagraph"/>
+        <w:ind w:left="0"/>
         <w:jc w:val="center"/>
         <w:rPr>
           <w:rStyle w:val="FakeCharacterStyle"/>
@@ -12891,12 +12734,8 @@
           <w:highlight w:val="cyan"/>
           <w:lang w:val="en-US"/>
         </w:rPr>
-        <w:t>Machine report + stress/strain curves</w:t>
-      </w:r>
-    </w:p>
-    <w:p>
-      <w:pPr>
-        <w:jc w:val="center"/>
+      </w:r>
+      <w:r>
         <w:rPr>
           <w:rStyle w:val="FakeCharacterStyle"/>
           <w:rFonts w:cstheme="minorHAnsi"/>
@@ -12905,12 +12744,16 @@
           <w:noProof/>
           <w:sz w:val="22"/>
           <w:szCs w:val="22"/>
-          <w:lang w:val="en-US"/>
-        </w:rPr>
-      </w:pPr>
+          <w:highlight w:val="cyan"/>
+          <w:lang w:val="en-US"/>
+        </w:rPr>
+        <w:t>{{image:infusion_snapshot}}</w:t>
+      </w:r>
     </w:p>
     <w:p>
       <w:pPr>
+        <w:pStyle w:val="ListParagraph"/>
+        <w:ind w:left="0"/>
         <w:jc w:val="center"/>
         <w:rPr>
           <w:rStyle w:val="FakeCharacterStyle"/>
@@ -12928,6 +12771,125 @@
       <w:pPr>
         <w:jc w:val="center"/>
         <w:rPr>
+          <w:b/>
+          <w:bCs/>
+          <w:lang w:val="en-US"/>
+        </w:rPr>
+      </w:pPr>
+      <w:r>
+        <w:rPr>
+          <w:b/>
+          <w:bCs/>
+          <w:lang w:val="en-US"/>
+        </w:rPr>
+        <w:t xml:space="preserve">Appendix </w:t>
+      </w:r>
+      <w:r>
+        <w:rPr>
+          <w:b/>
+          <w:bCs/>
+          <w:lang w:val="en-US"/>
+        </w:rPr>
+        <w:t>3</w:t>
+      </w:r>
+      <w:r>
+        <w:rPr>
+          <w:b/>
+          <w:bCs/>
+          <w:lang w:val="en-US"/>
+        </w:rPr>
+        <w:t xml:space="preserve">: </w:t>
+      </w:r>
+      <w:r>
+        <w:rPr>
+          <w:b/>
+          <w:bCs/>
+          <w:lang w:val="en-US"/>
+        </w:rPr>
+      </w:r>
+      <w:r>
+        <w:rPr>
+          <w:b/>
+          <w:bCs/>
+          <w:lang w:val="en-US"/>
+        </w:rPr>
+        <w:t>{{tr_number}} – {{tensile_test}}</w:t>
+      </w:r>
+      <w:r>
+        <w:rPr>
+          <w:b/>
+          <w:bCs/>
+          <w:highlight w:val="cyan"/>
+          <w:lang w:val="en-US"/>
+        </w:rPr>
+      </w:r>
+      <w:r>
+        <w:rPr>
+          <w:b/>
+          <w:bCs/>
+          <w:lang w:val="en-US"/>
+        </w:rPr>
+      </w:r>
+      <w:r>
+        <w:rPr>
+          <w:b/>
+          <w:bCs/>
+          <w:highlight w:val="cyan"/>
+          <w:lang w:val="en-US"/>
+        </w:rPr>
+      </w:r>
+      <w:r>
+        <w:rPr>
+          <w:b/>
+          <w:bCs/>
+          <w:lang w:val="en-US"/>
+        </w:rPr>
+      </w:r>
+      <w:r>
+        <w:rPr>
+          <w:b/>
+          <w:bCs/>
+          <w:highlight w:val="cyan"/>
+          <w:lang w:val="en-US"/>
+        </w:rPr>
+      </w:r>
+      <w:r>
+        <w:rPr>
+          <w:b/>
+          <w:bCs/>
+          <w:lang w:val="en-US"/>
+        </w:rPr>
+        <w:t xml:space="preserve"> </w:t>
+      </w:r>
+      <w:r>
+        <w:rPr>
+          <w:b/>
+          <w:bCs/>
+          <w:lang w:val="en-US"/>
+        </w:rPr>
+        <w:t>–</w:t>
+      </w:r>
+      <w:r>
+        <w:rPr>
+          <w:b/>
+          <w:bCs/>
+          <w:lang w:val="en-US"/>
+        </w:rPr>
+        <w:t xml:space="preserve"> Test</w:t>
+      </w:r>
+      <w:r>
+        <w:rPr>
+          <w:b/>
+          <w:bCs/>
+          <w:lang w:val="en-US"/>
+        </w:rPr>
+        <w:t xml:space="preserve"> report</w:t>
+      </w:r>
+    </w:p>
+    <w:p>
+      <w:pPr>
+        <w:jc w:val="center"/>
+        <w:rPr>
           <w:rStyle w:val="FakeCharacterStyle"/>
           <w:rFonts w:cstheme="minorHAnsi"/>
           <w:b/>
@@ -12953,10 +12915,7 @@
           <w:lang w:val="en-US"/>
         </w:rPr>
       </w:pPr>
-    </w:p>
-    <w:p>
-      <w:pPr>
-        <w:jc w:val="center"/>
+      <w:r>
         <w:rPr>
           <w:rStyle w:val="FakeCharacterStyle"/>
           <w:rFonts w:cstheme="minorHAnsi"/>
@@ -12965,13 +12924,11 @@
           <w:noProof/>
           <w:sz w:val="22"/>
           <w:szCs w:val="22"/>
-          <w:lang w:val="en-US"/>
-        </w:rPr>
-      </w:pPr>
-    </w:p>
-    <w:p>
-      <w:pPr>
-        <w:jc w:val="center"/>
+          <w:highlight w:val="cyan"/>
+          <w:lang w:val="en-US"/>
+        </w:rPr>
+      </w:r>
+      <w:r>
         <w:rPr>
           <w:rStyle w:val="FakeCharacterStyle"/>
           <w:rFonts w:cstheme="minorHAnsi"/>
@@ -12980,9 +12937,11 @@
           <w:noProof/>
           <w:sz w:val="22"/>
           <w:szCs w:val="22"/>
-          <w:lang w:val="en-US"/>
-        </w:rPr>
-      </w:pPr>
+          <w:highlight w:val="cyan"/>
+          <w:lang w:val="en-US"/>
+        </w:rPr>
+        <w:t>{{image:tensile_report}}{{image:tensile_curves}}</w:t>
+      </w:r>
     </w:p>
     <w:p>
       <w:pPr>
@@ -13271,6 +13230,96 @@
     </w:p>
     <w:p>
       <w:pPr>
+        <w:jc w:val="center"/>
+        <w:rPr>
+          <w:rStyle w:val="FakeCharacterStyle"/>
+          <w:rFonts w:cstheme="minorHAnsi"/>
+          <w:b/>
+          <w:bCs/>
+          <w:noProof/>
+          <w:sz w:val="22"/>
+          <w:szCs w:val="22"/>
+          <w:lang w:val="en-US"/>
+        </w:rPr>
+      </w:pPr>
+    </w:p>
+    <w:p>
+      <w:pPr>
+        <w:jc w:val="center"/>
+        <w:rPr>
+          <w:rStyle w:val="FakeCharacterStyle"/>
+          <w:rFonts w:cstheme="minorHAnsi"/>
+          <w:b/>
+          <w:bCs/>
+          <w:noProof/>
+          <w:sz w:val="22"/>
+          <w:szCs w:val="22"/>
+          <w:lang w:val="en-US"/>
+        </w:rPr>
+      </w:pPr>
+    </w:p>
+    <w:p>
+      <w:pPr>
+        <w:jc w:val="center"/>
+        <w:rPr>
+          <w:rStyle w:val="FakeCharacterStyle"/>
+          <w:rFonts w:cstheme="minorHAnsi"/>
+          <w:b/>
+          <w:bCs/>
+          <w:noProof/>
+          <w:sz w:val="22"/>
+          <w:szCs w:val="22"/>
+          <w:lang w:val="en-US"/>
+        </w:rPr>
+      </w:pPr>
+    </w:p>
+    <w:p>
+      <w:pPr>
+        <w:jc w:val="center"/>
+        <w:rPr>
+          <w:rStyle w:val="FakeCharacterStyle"/>
+          <w:rFonts w:cstheme="minorHAnsi"/>
+          <w:b/>
+          <w:bCs/>
+          <w:noProof/>
+          <w:sz w:val="22"/>
+          <w:szCs w:val="22"/>
+          <w:lang w:val="en-US"/>
+        </w:rPr>
+      </w:pPr>
+    </w:p>
+    <w:p>
+      <w:pPr>
+        <w:jc w:val="center"/>
+        <w:rPr>
+          <w:rStyle w:val="FakeCharacterStyle"/>
+          <w:rFonts w:cstheme="minorHAnsi"/>
+          <w:b/>
+          <w:bCs/>
+          <w:noProof/>
+          <w:sz w:val="22"/>
+          <w:szCs w:val="22"/>
+          <w:lang w:val="en-US"/>
+        </w:rPr>
+      </w:pPr>
+    </w:p>
+    <w:p>
+      <w:pPr>
+        <w:jc w:val="center"/>
+        <w:rPr>
+          <w:rStyle w:val="FakeCharacterStyle"/>
+          <w:rFonts w:cstheme="minorHAnsi"/>
+          <w:b/>
+          <w:bCs/>
+          <w:noProof/>
+          <w:sz w:val="22"/>
+          <w:szCs w:val="22"/>
+          <w:lang w:val="en-US"/>
+        </w:rPr>
+      </w:pPr>
+    </w:p>
+    <w:p>
+      <w:pPr>
         <w:spacing w:after="0"/>
         <w:jc w:val="center"/>
         <w:rPr>
@@ -13309,7 +13358,14 @@
           <w:bCs/>
           <w:lang w:val="en-US"/>
         </w:rPr>
-        <w:t>TR</w:t>
+      </w:r>
+      <w:r>
+        <w:rPr>
+          <w:b/>
+          <w:bCs/>
+          <w:lang w:val="en-US"/>
+        </w:rPr>
+        <w:t>{{tr_number}} – {{tensile_test}}</w:t>
       </w:r>
       <w:r>
         <w:rPr>
@@ -13318,7 +13374,6 @@
           <w:highlight w:val="cyan"/>
           <w:lang w:val="en-US"/>
         </w:rPr>
-        <w:t>YY</w:t>
       </w:r>
       <w:r>
         <w:rPr>
@@ -13326,7 +13381,6 @@
           <w:bCs/>
           <w:lang w:val="en-US"/>
         </w:rPr>
-        <w:t>_C</w:t>
       </w:r>
       <w:r>
         <w:rPr>
@@ -13335,7 +13389,6 @@
           <w:highlight w:val="cyan"/>
           <w:lang w:val="en-US"/>
         </w:rPr>
-        <w:t>XXXX</w:t>
       </w:r>
       <w:r>
         <w:rPr>
@@ -13343,7 +13396,6 @@
           <w:bCs/>
           <w:lang w:val="en-US"/>
         </w:rPr>
-        <w:t xml:space="preserve">– </w:t>
       </w:r>
       <w:r>
         <w:rPr>
@@ -13352,7 +13404,6 @@
           <w:highlight w:val="cyan"/>
           <w:lang w:val="en-US"/>
         </w:rPr>
-        <w:t>Test name</w:t>
       </w:r>
       <w:r>
         <w:rPr>
@@ -13393,7 +13444,14 @@
           <w:highlight w:val="cyan"/>
           <w:lang w:val="en-US"/>
         </w:rPr>
-        <w:t>Picture before test</w:t>
+      </w:r>
+      <w:r>
+        <w:rPr>
+          <w:noProof/>
+          <w:highlight w:val="cyan"/>
+          <w:lang w:val="en-US"/>
+        </w:rPr>
+        <w:t>{{image:pictures_before}}</w:t>
       </w:r>
     </w:p>
     <w:p>
@@ -13421,7 +13479,14 @@
           <w:highlight w:val="cyan"/>
           <w:lang w:val="en-US"/>
         </w:rPr>
-        <w:t>Picture before test</w:t>
+      </w:r>
+      <w:r>
+        <w:rPr>
+          <w:noProof/>
+          <w:highlight w:val="cyan"/>
+          <w:lang w:val="en-US"/>
+        </w:rPr>
+        <w:t>{{image:pictures_after}}</w:t>
       </w:r>
     </w:p>
     <w:p>

</xml_diff>